<commit_message>
chore: add R history file and LiveBook documentation file
</commit_message>
<xml_diff>
--- a/LiveBook/LB_AI/Methode_LiveBook_UIMM_v1.1.docx
+++ b/LiveBook/LB_AI/Methode_LiveBook_UIMM_v1.1.docx
@@ -2136,12 +2136,6 @@
         <w:gridCol w:w="3660"/>
       </w:tblGrid>
       <w:tr>
-        <w:tblPrEx>
-          <w:tblCellMar>
-            <w:top w:w="0" w:type="dxa"/>
-            <w:bottom w:w="0" w:type="dxa"/>
-          </w:tblCellMar>
-        </w:tblPrEx>
         <w:tc>
           <w:tcPr>
             <w:tcW w:w="2300" w:type="dxa"/>
@@ -2231,12 +2225,6 @@
         </w:tc>
       </w:tr>
       <w:tr>
-        <w:tblPrEx>
-          <w:tblCellMar>
-            <w:top w:w="0" w:type="dxa"/>
-            <w:bottom w:w="0" w:type="dxa"/>
-          </w:tblCellMar>
-        </w:tblPrEx>
         <w:tc>
           <w:tcPr>
             <w:tcW w:w="2300" w:type="dxa"/>
@@ -2319,12 +2307,6 @@
         </w:tc>
       </w:tr>
       <w:tr>
-        <w:tblPrEx>
-          <w:tblCellMar>
-            <w:top w:w="0" w:type="dxa"/>
-            <w:bottom w:w="0" w:type="dxa"/>
-          </w:tblCellMar>
-        </w:tblPrEx>
         <w:tc>
           <w:tcPr>
             <w:tcW w:w="2300" w:type="dxa"/>
@@ -2405,12 +2387,6 @@
         </w:tc>
       </w:tr>
       <w:tr>
-        <w:tblPrEx>
-          <w:tblCellMar>
-            <w:top w:w="0" w:type="dxa"/>
-            <w:bottom w:w="0" w:type="dxa"/>
-          </w:tblCellMar>
-        </w:tblPrEx>
         <w:tc>
           <w:tcPr>
             <w:tcW w:w="2300" w:type="dxa"/>
@@ -2720,12 +2696,6 @@
         <w:gridCol w:w="2960"/>
       </w:tblGrid>
       <w:tr>
-        <w:tblPrEx>
-          <w:tblCellMar>
-            <w:top w:w="0" w:type="dxa"/>
-            <w:bottom w:w="0" w:type="dxa"/>
-          </w:tblCellMar>
-        </w:tblPrEx>
         <w:tc>
           <w:tcPr>
             <w:tcW w:w="1200" w:type="dxa"/>
@@ -2844,12 +2814,6 @@
         </w:tc>
       </w:tr>
       <w:tr>
-        <w:tblPrEx>
-          <w:tblCellMar>
-            <w:top w:w="0" w:type="dxa"/>
-            <w:bottom w:w="0" w:type="dxa"/>
-          </w:tblCellMar>
-        </w:tblPrEx>
         <w:tc>
           <w:tcPr>
             <w:tcW w:w="1200" w:type="dxa"/>
@@ -2956,12 +2920,6 @@
         </w:tc>
       </w:tr>
       <w:tr>
-        <w:tblPrEx>
-          <w:tblCellMar>
-            <w:top w:w="0" w:type="dxa"/>
-            <w:bottom w:w="0" w:type="dxa"/>
-          </w:tblCellMar>
-        </w:tblPrEx>
         <w:tc>
           <w:tcPr>
             <w:tcW w:w="1200" w:type="dxa"/>
@@ -3070,12 +3028,6 @@
         </w:tc>
       </w:tr>
       <w:tr>
-        <w:tblPrEx>
-          <w:tblCellMar>
-            <w:top w:w="0" w:type="dxa"/>
-            <w:bottom w:w="0" w:type="dxa"/>
-          </w:tblCellMar>
-        </w:tblPrEx>
         <w:tc>
           <w:tcPr>
             <w:tcW w:w="1200" w:type="dxa"/>
@@ -3182,12 +3134,6 @@
         </w:tc>
       </w:tr>
       <w:tr>
-        <w:tblPrEx>
-          <w:tblCellMar>
-            <w:top w:w="0" w:type="dxa"/>
-            <w:bottom w:w="0" w:type="dxa"/>
-          </w:tblCellMar>
-        </w:tblPrEx>
         <w:tc>
           <w:tcPr>
             <w:tcW w:w="1200" w:type="dxa"/>
@@ -3303,12 +3249,6 @@
         </w:tc>
       </w:tr>
       <w:tr>
-        <w:tblPrEx>
-          <w:tblCellMar>
-            <w:top w:w="0" w:type="dxa"/>
-            <w:bottom w:w="0" w:type="dxa"/>
-          </w:tblCellMar>
-        </w:tblPrEx>
         <w:tc>
           <w:tcPr>
             <w:tcW w:w="1200" w:type="dxa"/>
@@ -3575,12 +3515,6 @@
         <w:gridCol w:w="3050"/>
       </w:tblGrid>
       <w:tr>
-        <w:tblPrEx>
-          <w:tblCellMar>
-            <w:top w:w="0" w:type="dxa"/>
-            <w:bottom w:w="0" w:type="dxa"/>
-          </w:tblCellMar>
-        </w:tblPrEx>
         <w:tc>
           <w:tcPr>
             <w:tcW w:w="600" w:type="dxa"/>
@@ -3699,12 +3633,6 @@
         </w:tc>
       </w:tr>
       <w:tr>
-        <w:tblPrEx>
-          <w:tblCellMar>
-            <w:top w:w="0" w:type="dxa"/>
-            <w:bottom w:w="0" w:type="dxa"/>
-          </w:tblCellMar>
-        </w:tblPrEx>
         <w:tc>
           <w:tcPr>
             <w:tcW w:w="600" w:type="dxa"/>
@@ -3820,12 +3748,6 @@
         </w:tc>
       </w:tr>
       <w:tr>
-        <w:tblPrEx>
-          <w:tblCellMar>
-            <w:top w:w="0" w:type="dxa"/>
-            <w:bottom w:w="0" w:type="dxa"/>
-          </w:tblCellMar>
-        </w:tblPrEx>
         <w:tc>
           <w:tcPr>
             <w:tcW w:w="600" w:type="dxa"/>
@@ -3932,12 +3854,6 @@
         </w:tc>
       </w:tr>
       <w:tr>
-        <w:tblPrEx>
-          <w:tblCellMar>
-            <w:top w:w="0" w:type="dxa"/>
-            <w:bottom w:w="0" w:type="dxa"/>
-          </w:tblCellMar>
-        </w:tblPrEx>
         <w:tc>
           <w:tcPr>
             <w:tcW w:w="600" w:type="dxa"/>
@@ -4044,12 +3960,6 @@
         </w:tc>
       </w:tr>
       <w:tr>
-        <w:tblPrEx>
-          <w:tblCellMar>
-            <w:top w:w="0" w:type="dxa"/>
-            <w:bottom w:w="0" w:type="dxa"/>
-          </w:tblCellMar>
-        </w:tblPrEx>
         <w:tc>
           <w:tcPr>
             <w:tcW w:w="600" w:type="dxa"/>
@@ -4156,12 +4066,6 @@
         </w:tc>
       </w:tr>
       <w:tr>
-        <w:tblPrEx>
-          <w:tblCellMar>
-            <w:top w:w="0" w:type="dxa"/>
-            <w:bottom w:w="0" w:type="dxa"/>
-          </w:tblCellMar>
-        </w:tblPrEx>
         <w:tc>
           <w:tcPr>
             <w:tcW w:w="600" w:type="dxa"/>
@@ -4886,12 +4790,6 @@
         <w:gridCol w:w="3380"/>
       </w:tblGrid>
       <w:tr>
-        <w:tblPrEx>
-          <w:tblCellMar>
-            <w:top w:w="0" w:type="dxa"/>
-            <w:bottom w:w="0" w:type="dxa"/>
-          </w:tblCellMar>
-        </w:tblPrEx>
         <w:tc>
           <w:tcPr>
             <w:tcW w:w="1800" w:type="dxa"/>
@@ -4981,12 +4879,6 @@
         </w:tc>
       </w:tr>
       <w:tr>
-        <w:tblPrEx>
-          <w:tblCellMar>
-            <w:top w:w="0" w:type="dxa"/>
-            <w:bottom w:w="0" w:type="dxa"/>
-          </w:tblCellMar>
-        </w:tblPrEx>
         <w:tc>
           <w:tcPr>
             <w:tcW w:w="1800" w:type="dxa"/>
@@ -5067,12 +4959,6 @@
         </w:tc>
       </w:tr>
       <w:tr>
-        <w:tblPrEx>
-          <w:tblCellMar>
-            <w:top w:w="0" w:type="dxa"/>
-            <w:bottom w:w="0" w:type="dxa"/>
-          </w:tblCellMar>
-        </w:tblPrEx>
         <w:tc>
           <w:tcPr>
             <w:tcW w:w="1800" w:type="dxa"/>
@@ -5153,12 +5039,6 @@
         </w:tc>
       </w:tr>
       <w:tr>
-        <w:tblPrEx>
-          <w:tblCellMar>
-            <w:top w:w="0" w:type="dxa"/>
-            <w:bottom w:w="0" w:type="dxa"/>
-          </w:tblCellMar>
-        </w:tblPrEx>
         <w:tc>
           <w:tcPr>
             <w:tcW w:w="1800" w:type="dxa"/>
@@ -5271,12 +5151,6 @@
         </w:tc>
       </w:tr>
       <w:tr>
-        <w:tblPrEx>
-          <w:tblCellMar>
-            <w:top w:w="0" w:type="dxa"/>
-            <w:bottom w:w="0" w:type="dxa"/>
-          </w:tblCellMar>
-        </w:tblPrEx>
         <w:tc>
           <w:tcPr>
             <w:tcW w:w="1800" w:type="dxa"/>
@@ -5366,12 +5240,6 @@
         </w:tc>
       </w:tr>
       <w:tr>
-        <w:tblPrEx>
-          <w:tblCellMar>
-            <w:top w:w="0" w:type="dxa"/>
-            <w:bottom w:w="0" w:type="dxa"/>
-          </w:tblCellMar>
-        </w:tblPrEx>
         <w:tc>
           <w:tcPr>
             <w:tcW w:w="1800" w:type="dxa"/>
@@ -5610,12 +5478,6 @@
         <w:gridCol w:w="1800"/>
       </w:tblGrid>
       <w:tr>
-        <w:tblPrEx>
-          <w:tblCellMar>
-            <w:top w:w="0" w:type="dxa"/>
-            <w:bottom w:w="0" w:type="dxa"/>
-          </w:tblCellMar>
-        </w:tblPrEx>
         <w:tc>
           <w:tcPr>
             <w:tcW w:w="7560" w:type="dxa"/>
@@ -5676,12 +5538,6 @@
         </w:tc>
       </w:tr>
       <w:tr>
-        <w:tblPrEx>
-          <w:tblCellMar>
-            <w:top w:w="0" w:type="dxa"/>
-            <w:bottom w:w="0" w:type="dxa"/>
-          </w:tblCellMar>
-        </w:tblPrEx>
         <w:tc>
           <w:tcPr>
             <w:tcW w:w="7560" w:type="dxa"/>
@@ -5744,12 +5600,6 @@
         </w:tc>
       </w:tr>
       <w:tr>
-        <w:tblPrEx>
-          <w:tblCellMar>
-            <w:top w:w="0" w:type="dxa"/>
-            <w:bottom w:w="0" w:type="dxa"/>
-          </w:tblCellMar>
-        </w:tblPrEx>
         <w:tc>
           <w:tcPr>
             <w:tcW w:w="7560" w:type="dxa"/>
@@ -5796,12 +5646,6 @@
         </w:tc>
       </w:tr>
       <w:tr>
-        <w:tblPrEx>
-          <w:tblCellMar>
-            <w:top w:w="0" w:type="dxa"/>
-            <w:bottom w:w="0" w:type="dxa"/>
-          </w:tblCellMar>
-        </w:tblPrEx>
         <w:tc>
           <w:tcPr>
             <w:tcW w:w="7560" w:type="dxa"/>
@@ -5848,12 +5692,6 @@
         </w:tc>
       </w:tr>
       <w:tr>
-        <w:tblPrEx>
-          <w:tblCellMar>
-            <w:top w:w="0" w:type="dxa"/>
-            <w:bottom w:w="0" w:type="dxa"/>
-          </w:tblCellMar>
-        </w:tblPrEx>
         <w:tc>
           <w:tcPr>
             <w:tcW w:w="7560" w:type="dxa"/>
@@ -5900,12 +5738,6 @@
         </w:tc>
       </w:tr>
       <w:tr>
-        <w:tblPrEx>
-          <w:tblCellMar>
-            <w:top w:w="0" w:type="dxa"/>
-            <w:bottom w:w="0" w:type="dxa"/>
-          </w:tblCellMar>
-        </w:tblPrEx>
         <w:tc>
           <w:tcPr>
             <w:tcW w:w="7560" w:type="dxa"/>
@@ -5952,12 +5784,6 @@
         </w:tc>
       </w:tr>
       <w:tr>
-        <w:tblPrEx>
-          <w:tblCellMar>
-            <w:top w:w="0" w:type="dxa"/>
-            <w:bottom w:w="0" w:type="dxa"/>
-          </w:tblCellMar>
-        </w:tblPrEx>
         <w:tc>
           <w:tcPr>
             <w:tcW w:w="7560" w:type="dxa"/>
@@ -6004,12 +5830,6 @@
         </w:tc>
       </w:tr>
       <w:tr>
-        <w:tblPrEx>
-          <w:tblCellMar>
-            <w:top w:w="0" w:type="dxa"/>
-            <w:bottom w:w="0" w:type="dxa"/>
-          </w:tblCellMar>
-        </w:tblPrEx>
         <w:tc>
           <w:tcPr>
             <w:tcW w:w="7560" w:type="dxa"/>
@@ -7202,7 +7022,13 @@
         <w:pStyle w:val="Titre2"/>
       </w:pPr>
       <w:bookmarkStart w:id="30" w:name="_Toc232187082"/>
-      <w:r>
+    </w:p>
+    <w:p>
+      <w:pPr>
+        <w:pStyle w:val="Titre2"/>
+      </w:pPr>
+      <w:r>
+        <w:lastRenderedPageBreak/>
         <w:t>A7. Claude — Génération du sommaire navigable</w:t>
       </w:r>
       <w:bookmarkEnd w:id="30"/>
@@ -7218,7 +7044,6 @@
           <w:sz w:val="18"/>
           <w:szCs w:val="18"/>
         </w:rPr>
-        <w:lastRenderedPageBreak/>
         <w:t>À partir de 01_structure.md, génère un artefact HTML : sommaire</w:t>
       </w:r>
     </w:p>

</xml_diff>